<commit_message>
Update report with clickable links
</commit_message>
<xml_diff>
--- a/report/MLOps_Assignment1_Report.docx
+++ b/report/MLOps_Assignment1_Report.docx
@@ -386,12 +386,29 @@
             <w:pPr>
               <w:spacing w:before="60" w:after="60"/>
             </w:pPr>
-            <w:r>
-              <w:rPr>
-                <w:sz w:val="22"/>
-              </w:rPr>
-              <w:t>https://github.com/Shreya2025ae05052/MLOps_Assignment1</w:t>
-            </w:r>
+            <w:hyperlink r:id="rId8" w:history="1">
+              <w:r>
+                <w:rPr>
+                  <w:rStyle w:val="Hyperlink"/>
+                  <w:sz w:val="22"/>
+                </w:rPr>
+                <w:t>https://github.com/Shrey</w:t>
+              </w:r>
+              <w:r>
+                <w:rPr>
+                  <w:rStyle w:val="Hyperlink"/>
+                  <w:sz w:val="22"/>
+                </w:rPr>
+                <w:t>a</w:t>
+              </w:r>
+              <w:r>
+                <w:rPr>
+                  <w:rStyle w:val="Hyperlink"/>
+                  <w:sz w:val="22"/>
+                </w:rPr>
+                <w:t>2025ae05052/MLOps_Assignment1</w:t>
+              </w:r>
+            </w:hyperlink>
           </w:p>
         </w:tc>
       </w:tr>
@@ -1393,7 +1410,7 @@
                     <pic:cNvPicPr/>
                   </pic:nvPicPr>
                   <pic:blipFill>
-                    <a:blip r:embed="rId8"/>
+                    <a:blip r:embed="rId9"/>
                     <a:stretch>
                       <a:fillRect/>
                     </a:stretch>
@@ -2045,7 +2062,7 @@
                     <pic:cNvPicPr/>
                   </pic:nvPicPr>
                   <pic:blipFill>
-                    <a:blip r:embed="rId9"/>
+                    <a:blip r:embed="rId10"/>
                     <a:stretch>
                       <a:fillRect/>
                     </a:stretch>
@@ -2124,7 +2141,7 @@
                           <pic:cNvPicPr/>
                         </pic:nvPicPr>
                         <pic:blipFill>
-                          <a:blip r:embed="rId10"/>
+                          <a:blip r:embed="rId11"/>
                           <a:stretch>
                             <a:fillRect/>
                           </a:stretch>
@@ -2175,7 +2192,7 @@
                           <pic:cNvPicPr/>
                         </pic:nvPicPr>
                         <pic:blipFill>
-                          <a:blip r:embed="rId11"/>
+                          <a:blip r:embed="rId12"/>
                           <a:stretch>
                             <a:fillRect/>
                           </a:stretch>
@@ -3015,7 +3032,7 @@
                           <pic:cNvPicPr/>
                         </pic:nvPicPr>
                         <pic:blipFill>
-                          <a:blip r:embed="rId12"/>
+                          <a:blip r:embed="rId13"/>
                           <a:stretch>
                             <a:fillRect/>
                           </a:stretch>
@@ -3066,7 +3083,7 @@
                           <pic:cNvPicPr/>
                         </pic:nvPicPr>
                         <pic:blipFill>
-                          <a:blip r:embed="rId13"/>
+                          <a:blip r:embed="rId14"/>
                           <a:stretch>
                             <a:fillRect/>
                           </a:stretch>
@@ -3192,7 +3209,7 @@
                     <pic:cNvPicPr/>
                   </pic:nvPicPr>
                   <pic:blipFill>
-                    <a:blip r:embed="rId14"/>
+                    <a:blip r:embed="rId15"/>
                     <a:stretch>
                       <a:fillRect/>
                     </a:stretch>
@@ -3272,7 +3289,7 @@
                     <pic:cNvPicPr/>
                   </pic:nvPicPr>
                   <pic:blipFill>
-                    <a:blip r:embed="rId15"/>
+                    <a:blip r:embed="rId16"/>
                     <a:stretch>
                       <a:fillRect/>
                     </a:stretch>
@@ -3333,7 +3350,7 @@
                     <pic:cNvPicPr/>
                   </pic:nvPicPr>
                   <pic:blipFill>
-                    <a:blip r:embed="rId16"/>
+                    <a:blip r:embed="rId17"/>
                     <a:stretch>
                       <a:fillRect/>
                     </a:stretch>
@@ -3507,7 +3524,7 @@
                     <pic:cNvPicPr/>
                   </pic:nvPicPr>
                   <pic:blipFill>
-                    <a:blip r:embed="rId17"/>
+                    <a:blip r:embed="rId18"/>
                     <a:stretch>
                       <a:fillRect/>
                     </a:stretch>
@@ -3610,7 +3627,7 @@
                     <pic:cNvPicPr/>
                   </pic:nvPicPr>
                   <pic:blipFill>
-                    <a:blip r:embed="rId18"/>
+                    <a:blip r:embed="rId19"/>
                     <a:stretch>
                       <a:fillRect/>
                     </a:stretch>
@@ -3679,7 +3696,7 @@
                     <pic:cNvPicPr/>
                   </pic:nvPicPr>
                   <pic:blipFill>
-                    <a:blip r:embed="rId19"/>
+                    <a:blip r:embed="rId20"/>
                     <a:stretch>
                       <a:fillRect/>
                     </a:stretch>
@@ -3740,7 +3757,7 @@
                     <pic:cNvPicPr/>
                   </pic:nvPicPr>
                   <pic:blipFill>
-                    <a:blip r:embed="rId20"/>
+                    <a:blip r:embed="rId21"/>
                     <a:stretch>
                       <a:fillRect/>
                     </a:stretch>
@@ -4030,7 +4047,7 @@
                     <pic:cNvPicPr/>
                   </pic:nvPicPr>
                   <pic:blipFill>
-                    <a:blip r:embed="rId21"/>
+                    <a:blip r:embed="rId22"/>
                     <a:stretch>
                       <a:fillRect/>
                     </a:stretch>
@@ -4091,7 +4108,7 @@
                     <pic:cNvPicPr/>
                   </pic:nvPicPr>
                   <pic:blipFill>
-                    <a:blip r:embed="rId22"/>
+                    <a:blip r:embed="rId23"/>
                     <a:stretch>
                       <a:fillRect/>
                     </a:stretch>
@@ -4239,7 +4256,7 @@
                     <pic:cNvPicPr/>
                   </pic:nvPicPr>
                   <pic:blipFill>
-                    <a:blip r:embed="rId23"/>
+                    <a:blip r:embed="rId24"/>
                     <a:stretch>
                       <a:fillRect/>
                     </a:stretch>
@@ -4300,7 +4317,7 @@
                     <pic:cNvPicPr/>
                   </pic:nvPicPr>
                   <pic:blipFill>
-                    <a:blip r:embed="rId24"/>
+                    <a:blip r:embed="rId25"/>
                     <a:stretch>
                       <a:fillRect/>
                     </a:stretch>
@@ -4462,7 +4479,7 @@
                     <pic:cNvPicPr/>
                   </pic:nvPicPr>
                   <pic:blipFill>
-                    <a:blip r:embed="rId25"/>
+                    <a:blip r:embed="rId26"/>
                     <a:stretch>
                       <a:fillRect/>
                     </a:stretch>
@@ -4534,7 +4551,7 @@
                     <pic:cNvPicPr/>
                   </pic:nvPicPr>
                   <pic:blipFill>
-                    <a:blip r:embed="rId26"/>
+                    <a:blip r:embed="rId27"/>
                     <a:stretch>
                       <a:fillRect/>
                     </a:stretch>
@@ -4617,7 +4634,7 @@
                     <pic:cNvPicPr/>
                   </pic:nvPicPr>
                   <pic:blipFill>
-                    <a:blip r:embed="rId27"/>
+                    <a:blip r:embed="rId28"/>
                     <a:stretch>
                       <a:fillRect/>
                     </a:stretch>
@@ -4805,12 +4822,29 @@
         </w:rPr>
         <w:t xml:space="preserve">Code repository: </w:t>
       </w:r>
-      <w:r>
-        <w:t>https://github.com/Shreya2025ae05052/MLOps_Assignment1</w:t>
-      </w:r>
+      <w:hyperlink r:id="rId29" w:history="1">
+        <w:r>
+          <w:rPr>
+            <w:rStyle w:val="Hyperlink"/>
+          </w:rPr>
+          <w:t>https://github.com/Sh</w:t>
+        </w:r>
+        <w:r>
+          <w:rPr>
+            <w:rStyle w:val="Hyperlink"/>
+          </w:rPr>
+          <w:t>r</w:t>
+        </w:r>
+        <w:r>
+          <w:rPr>
+            <w:rStyle w:val="Hyperlink"/>
+          </w:rPr>
+          <w:t>eya2025ae05052/MLOps_Assignment1</w:t>
+        </w:r>
+      </w:hyperlink>
     </w:p>
     <w:sectPr>
-      <w:footerReference w:type="default" r:id="rId28"/>
+      <w:footerReference w:type="default" r:id="rId30"/>
       <w:pgSz w:w="11906" w:h="16838"/>
       <w:pgMar w:top="720" w:right="720" w:bottom="720" w:left="720" w:header="720" w:footer="720" w:gutter="0"/>
       <w:cols w:space="720"/>
@@ -16518,6 +16552,30 @@
       <w:u w:val="single"/>
     </w:rPr>
   </w:style>
+  <w:style w:type="character" w:styleId="UnresolvedMention">
+    <w:name w:val="Unresolved Mention"/>
+    <w:basedOn w:val="DefaultParagraphFont"/>
+    <w:uiPriority w:val="99"/>
+    <w:semiHidden/>
+    <w:unhideWhenUsed/>
+    <w:rsid w:val="003300A7"/>
+    <w:rPr>
+      <w:color w:val="605E5C"/>
+      <w:shd w:val="clear" w:color="auto" w:fill="E1DFDD"/>
+    </w:rPr>
+  </w:style>
+  <w:style w:type="character" w:styleId="FollowedHyperlink">
+    <w:name w:val="FollowedHyperlink"/>
+    <w:basedOn w:val="DefaultParagraphFont"/>
+    <w:uiPriority w:val="99"/>
+    <w:semiHidden/>
+    <w:unhideWhenUsed/>
+    <w:rsid w:val="003300A7"/>
+    <w:rPr>
+      <w:color w:val="800080" w:themeColor="followedHyperlink"/>
+      <w:u w:val="single"/>
+    </w:rPr>
+  </w:style>
 </w:styles>
 </file>
 

</xml_diff>